<commit_message>
fix: resolve figure aspect ratios for run-prefixed filenames
The ratio map was keyed on the interim figure names, so the renamed
transformer_h1_* figures fell through to the 0.5 fallback and rendered
distorted in the report. Lookup now matches by suffix.

Co-Authored-By: Claude Opus 5 <noreply@anthropic.com>
</commit_message>
<xml_diff>
--- a/report/final_report.docx
+++ b/report/final_report.docx
@@ -2421,7 +2421,7 @@
       <w:r>
         <w:drawing>
           <wp:inline distT="0" distB="0" distL="0" distR="0">
-            <wp:extent cx="5394960" cy="2697480"/>
+            <wp:extent cx="5394960" cy="3021178"/>
             <wp:effectExtent t="0" r="0" b="0" l="0"/>
             <wp:docPr id="1" name="" descr="" title=""/>
             <wp:cNvGraphicFramePr>
@@ -2446,7 +2446,7 @@
                   <pic:spPr bwMode="auto">
                     <a:xfrm>
                       <a:off x="0" y="0"/>
-                      <a:ext cx="5394960" cy="2697480"/>
+                      <a:ext cx="5394960" cy="3021178"/>
                     </a:xfrm>
                     <a:prstGeom prst="rect">
                       <a:avLst/>
@@ -3419,7 +3419,7 @@
       <w:r>
         <w:drawing>
           <wp:inline distT="0" distB="0" distL="0" distR="0">
-            <wp:extent cx="5303520" cy="2651760"/>
+            <wp:extent cx="5303520" cy="3244506"/>
             <wp:effectExtent t="0" r="0" b="0" l="0"/>
             <wp:docPr id="1" name="" descr="" title=""/>
             <wp:cNvGraphicFramePr>
@@ -3444,7 +3444,7 @@
                   <pic:spPr bwMode="auto">
                     <a:xfrm>
                       <a:off x="0" y="0"/>
-                      <a:ext cx="5303520" cy="2651760"/>
+                      <a:ext cx="5303520" cy="3244506"/>
                     </a:xfrm>
                     <a:prstGeom prst="rect">
                       <a:avLst/>
@@ -3527,7 +3527,7 @@
       <w:r>
         <w:drawing>
           <wp:inline distT="0" distB="0" distL="0" distR="0">
-            <wp:extent cx="5943600" cy="2971800"/>
+            <wp:extent cx="5943600" cy="2627697"/>
             <wp:effectExtent t="0" r="0" b="0" l="0"/>
             <wp:docPr id="1" name="" descr="" title=""/>
             <wp:cNvGraphicFramePr>
@@ -3552,7 +3552,7 @@
                   <pic:spPr bwMode="auto">
                     <a:xfrm>
                       <a:off x="0" y="0"/>
-                      <a:ext cx="5943600" cy="2971800"/>
+                      <a:ext cx="5943600" cy="2627697"/>
                     </a:xfrm>
                     <a:prstGeom prst="rect">
                       <a:avLst/>
@@ -3621,7 +3621,7 @@
       <w:r>
         <w:drawing>
           <wp:inline distT="0" distB="0" distL="0" distR="0">
-            <wp:extent cx="5943600" cy="2971800"/>
+            <wp:extent cx="5943600" cy="2377440"/>
             <wp:effectExtent t="0" r="0" b="0" l="0"/>
             <wp:docPr id="1" name="" descr="" title=""/>
             <wp:cNvGraphicFramePr>
@@ -3646,7 +3646,7 @@
                   <pic:spPr bwMode="auto">
                     <a:xfrm>
                       <a:off x="0" y="0"/>
-                      <a:ext cx="5943600" cy="2971800"/>
+                      <a:ext cx="5943600" cy="2377440"/>
                     </a:xfrm>
                     <a:prstGeom prst="rect">
                       <a:avLst/>

</xml_diff>

<commit_message>
fix: repair generated notebook and correct claims in the deliverables
The notebook generator split cell text without keeping line terminators.
nbformat concatenates `source` with no separator, so every cell of the
committed notebook collapsed onto one line and each code cell raised
SyntaxError on execution. Split with keepends, and stamp the cell ids
that nbformat 4.5 requires.

Slide 10 stacked two figures 0.89" into each other, hiding the x-axis
and lower traces of the actual-vs-predicted plot.

Corrections to text that no longer matched the final run:

- report intro and notebook cited RMSE 0.46 kW, the superseded interim
  value; the final run is 0.4494
- Table 2 credited a mean-pooling ablation that was never run
- the 4.3/5.6 kW peak maxima are full-test-period figures but were
  attributed to Figure 4, which plots only the first two weeks
- Figure 2's caption pointed at a dashed line the plot does not draw,
  and slide 7's notes at learning-rate steps it does not show
</commit_message>
<xml_diff>
--- a/report/final_report.docx
+++ b/report/final_report.docx
@@ -189,7 +189,7 @@
           <w:sz w:val="22"/>
           <w:szCs w:val="22"/>
         </w:rPr>
-        <w:t xml:space="preserve">This project asks a specific question: does a Transformer's self-attention mechanism capture the temporal structure of single-household demand well enough to beat the forecasts available for free? We take that comparison seriously, because it is the one most easily skipped. A model reporting an RMSE of 0.46 kW sounds precise in isolation; it is only meaningful once you know that simply repeating the previous hour's reading achieves 0.57 kW on the same data.</w:t>
+        <w:t xml:space="preserve">This project asks a specific question: does a Transformer's self-attention mechanism capture the temporal structure of single-household demand well enough to beat the forecasts available for free? We take that comparison seriously, because it is the one most easily skipped. A model reporting an RMSE of 0.45 kW sounds precise in isolation; it is only meaningful once you know that simply repeating the previous hour's reading achieves 0.57 kW on the same data.</w:t>
       </w:r>
     </w:p>
     <w:p>
@@ -2173,7 +2173,7 @@
                 <w:sz w:val="20"/>
                 <w:szCs w:val="20"/>
               </w:rPr>
-              <w:t xml:space="preserve">Ablated against mean pooling</w:t>
+              <w:t xml:space="preserve">Last step attends over the full window</w:t>
             </w:r>
           </w:p>
         </w:tc>
@@ -2473,7 +2473,7 @@
           <w:sz w:val="18"/>
           <w:szCs w:val="18"/>
         </w:rPr>
-        <w:t xml:space="preserve">Figure 2: Training and validation loss against epoch for the final early-stopped run. Validation loss reaches its minimum at epoch 11 (dashed line); early stopping halts training at epoch 19, once eight epochs pass without improvement.</w:t>
+        <w:t xml:space="preserve">Figure 2: Training and validation loss against epoch for the final early-stopped run. Validation loss reaches its minimum at epoch 11 (marked); early stopping halts training at epoch 19, once eight epochs pass without improvement.</w:t>
       </w:r>
     </w:p>
     <w:p>
@@ -3593,7 +3593,7 @@
           <w:sz w:val="22"/>
           <w:szCs w:val="22"/>
         </w:rPr>
-        <w:t xml:space="preserve">Figure 4 shows the model reproducing both the baseline load level and the timing of demand events, but systematically failing to reach peak magnitudes. Predicted maxima top out near 4.3 kW against observed maxima above 5.6 kW.</w:t>
+        <w:t xml:space="preserve">Figure 4 shows the model reproducing both the baseline load level and the timing of demand events, but systematically failing to reach peak magnitudes. Within the two weeks plotted, the highest observed hour reaches 3.77 kW against a predicted 2.57 kW. The same shortfall holds across the full test period, where predicted maxima top out at 4.27 kW against observed maxima of 5.63 kW.</w:t>
       </w:r>
     </w:p>
     <w:p>

</xml_diff>

<commit_message>
Finalize report, presentation, notebook, and demo updates
</commit_message>
<xml_diff>
--- a/report/final_report.docx
+++ b/report/final_report.docx
@@ -130,7 +130,7 @@
           <w:sz w:val="22"/>
           <w:szCs w:val="22"/>
         </w:rPr>
-        <w:t xml:space="preserve"> — the standard free baseline for hourly load. We report ablations over window length, model capacity, positional encoding, and feature set, and compare against a parameter-matched LSTM. Error analysis shows the dominant residual failure mode is systematic under-prediction of sharp demand peaks, a consequence of the squared-error objective rather than of insufficient capacity.</w:t>
+        <w:t xml:space="preserve"> — the standard free baseline for hourly load. We report ablations over window length, model capacity, positional encoding, and feature set, and compare against a comparably sized LSTM. Error analysis shows the dominant residual failure mode is systematic under-prediction of sharp demand peaks, a pattern that may be related to the squared-error objective.</w:t>
       </w:r>
     </w:p>
     <w:p>
@@ -260,7 +260,7 @@
           <w:sz w:val="22"/>
           <w:szCs w:val="22"/>
         </w:rPr>
-        <w:t xml:space="preserve">Ablations over window length, model capacity, positional encoding scheme, and feature set, plus a parameter-matched LSTM control.</w:t>
+        <w:t xml:space="preserve">Ablations over window length, model capacity, positional encoding scheme, and feature set, plus a comparably sized LSTM control.</w:t>
       </w:r>
     </w:p>
     <w:p>
@@ -1319,7 +1319,7 @@
           <w:sz w:val="22"/>
           <w:szCs w:val="22"/>
         </w:rPr>
-        <w:t xml:space="preserve">In a recurrent model, information from hour 1 of the window reaches the prediction only after passing through 23 sequential state updates, with each step attenuating and mixing the signal. Self-attention connects every pair of positions in a single operation, so the dependency length is constant regardless of separation. This matters for load data because the most informative context is frequently not the immediately preceding hour but the same hour on previous days — a relationship attention can represent directly as a high weight on a distant position.</w:t>
+        <w:t xml:space="preserve">In a recurrent model, information from hour 1 of the window reaches the prediction only after passing through 23 sequential state updates, with each step attenuating and mixing the signal. Self-attention connects every pair of positions in a single operation, so the dependency length is constant regardless of separation. Within our 24-hour input window, useful context may occur far from the most recent hour, including the same hour on the previous day.</w:t>
       </w:r>
     </w:p>
     <w:p>
@@ -2173,7 +2173,7 @@
                 <w:sz w:val="20"/>
                 <w:szCs w:val="20"/>
               </w:rPr>
-              <w:t xml:space="preserve">Ablated against mean pooling</w:t>
+              <w:t xml:space="preserve">Uses the final encoded time step as the sequence summary</w:t>
             </w:r>
           </w:p>
         </w:tc>
@@ -2410,7 +2410,7 @@
           <w:sz w:val="22"/>
           <w:szCs w:val="22"/>
         </w:rPr>
-        <w:t xml:space="preserve">Early stopping is not a formality here. Our interim 20-epoch run reached its best validation loss at epoch 9 and then deteriorated monotonically through epoch 20 while training loss continued to fall — a clean separation of the two curves and an unambiguous overfitting signature. The final run behaves as that experience predicted: validation loss bottoms out at 0.3161 at epoch 11, the schedule halves the learning rate as improvement stalls, and training halts at epoch 19 rather than spending eight further epochs overfitting. Figure 2 shows the final run's curves.</w:t>
+        <w:t xml:space="preserve">Early stopping is not a formality here. Our interim 20-epoch run reached its best validation loss at epoch 9 and never improved beyond that point while training loss generally continued to fall — a clean separation of the two curves and an unambiguous overfitting signature. The final run behaves as that experience predicted: validation loss bottoms out at 0.3161 at epoch 11, the schedule halves the learning rate as improvement stalls, and training halts at epoch 19 rather than spending eight further epochs overfitting. Figure 2 shows the final run's curves.</w:t>
       </w:r>
     </w:p>
     <w:p>
@@ -6203,7 +6203,7 @@
           <w:sz w:val="22"/>
           <w:szCs w:val="22"/>
         </w:rPr>
-        <w:t xml:space="preserve">Three results carry the table. The calendar features matter most: removing them costs more RMSE than any architectural change (0.4494 to 0.4617), even though the model could in principle recover the same information from the positional structure of the window. Second, more capacity only hurts — doubling depth or width degrades RMSE while multiplying parameters, confirming that at 34,000 training hours the binding constraint is data, not expressiveness. Third, the Transformer beats the parameter-matched LSTM control (RMSE 0.4494 vs. 0.4579, skill 21.8% vs. 20.3%) — a real but modest margin that is consistent with attention helping most at the event transitions the error analysis identified.</w:t>
+        <w:t xml:space="preserve">Three results carry the table. The calendar features matter most: removing them costs more RMSE than any architectural change (0.4494 to 0.4617), showing that explicit time-of-day and calendar information improves forecasting performance. Second, more capacity only hurts — doubling depth or width degrades RMSE while multiplying parameters, showing that the larger-capacity models we tested did not improve performance with roughly 24,000 training hours. Third, the Transformer beats the comparably sized LSTM control (RMSE 0.4494 vs. 0.4579, skill 21.8% vs. 20.3%) — a real but modest margin that is consistent with attention helping most at the event transitions the error analysis identified.</w:t>
       </w:r>
     </w:p>
     <w:p>
@@ -6489,7 +6489,7 @@
           <w:sz w:val="22"/>
           <w:szCs w:val="22"/>
         </w:rPr>
-        <w:t xml:space="preserve">Attention interpretability. Visualizing attention weights would test the hypothesis that the model attends to the same hour on previous days, which motivated the architecture choice.</w:t>
+        <w:t xml:space="preserve">Attention interpretability. Visualizing attention weights would help identify which parts of the previous 24 hours contribute most to the forecast.</w:t>
       </w:r>
     </w:p>
     <w:p>
@@ -6538,7 +6538,7 @@
           <w:sz w:val="22"/>
           <w:szCs w:val="22"/>
         </w:rPr>
-        <w:t xml:space="preserve">We implemented an encoder-only Transformer for one-hour-ahead household electricity load forecasting and evaluated it against the reference forecasters that any such model must beat to be worth deploying. On held-out data the model achieves an MAE of 0.3062 kW and an RMSE of 0.4494 kW, reducing RMSE by 21.8% relative to naive persistence. Error analysis shows the remaining error is dominated by systematic under-prediction of demand peaks — a consequence of the squared-error objective rather than of model capacity, and the clearest direction for future work.</w:t>
+        <w:t xml:space="preserve">We implemented an encoder-only Transformer for one-hour-ahead household electricity load forecasting and evaluated it against the reference forecasters that any such model must beat to be worth its complexity. On held-out data the model achieves an MAE of 0.3062 kW and an RMSE of 0.4494 kW, reducing RMSE by 21.8% relative to naive persistence. Error analysis shows the remaining error is dominated by systematic under-prediction of demand peaks, a pattern that may be related to the squared-error objective and is an important direction for future work.</w:t>
       </w:r>
     </w:p>
     <w:p>

</xml_diff>

<commit_message>
Add 11 references to the final report
</commit_message>
<xml_diff>
--- a/report/final_report.docx
+++ b/report/final_report.docx
@@ -6729,6 +6729,160 @@
           <w:szCs w:val="21"/>
         </w:rPr>
         <w:t xml:space="preserve">[12]  Y. Nie, N. H. Nguyen, P. Sinthong, and J. Kalagnanam, "A time series is worth 64 words: Long-term forecasting with transformers," in Proc. International Conference on Learning Representations (ICLR), 2023.</w:t>
+      </w:r>
+    </w:p>
+    <w:p>
+      <w:pPr>
+        <w:spacing w:after="130" w:line="260"/>
+        <w:ind w:left="360" w:hanging="360"/>
+      </w:pPr>
+      <w:r>
+        <w:rPr>
+          <w:rFonts w:ascii="Calibri" w:cs="Calibri" w:eastAsia="Calibri" w:hAnsi="Calibri"/>
+          <w:sz w:val="21"/>
+          <w:szCs w:val="21"/>
+        </w:rPr>
+        <w:t xml:space="preserve">[13]  D. L. Marino, K. Amarasinghe, and M. Manic, "Building energy load forecasting using deep neural networks," in Proc. 42nd Annual Conference of the IEEE Industrial Electronics Society (IECON), 2016, pp. 7046–7051.</w:t>
+      </w:r>
+    </w:p>
+    <w:p>
+      <w:pPr>
+        <w:spacing w:after="130" w:line="260"/>
+        <w:ind w:left="360" w:hanging="360"/>
+      </w:pPr>
+      <w:r>
+        <w:rPr>
+          <w:rFonts w:ascii="Calibri" w:cs="Calibri" w:eastAsia="Calibri" w:hAnsi="Calibri"/>
+          <w:sz w:val="21"/>
+          <w:szCs w:val="21"/>
+        </w:rPr>
+        <w:t xml:space="preserve">[14]  T.-Y. Kim and S.-B. Cho, "Predicting residential energy consumption using CNN-LSTM neural networks," Energy, vol. 182, pp. 72–81, 2019.</w:t>
+      </w:r>
+    </w:p>
+    <w:p>
+      <w:pPr>
+        <w:spacing w:after="130" w:line="260"/>
+        <w:ind w:left="360" w:hanging="360"/>
+      </w:pPr>
+      <w:r>
+        <w:rPr>
+          <w:rFonts w:ascii="Calibri" w:cs="Calibri" w:eastAsia="Calibri" w:hAnsi="Calibri"/>
+          <w:sz w:val="21"/>
+          <w:szCs w:val="21"/>
+        </w:rPr>
+        <w:t xml:space="preserve">[15]  D. Salinas, V. Flunkert, J. Gasthaus, and T. Januschowski, "DeepAR: Probabilistic forecasting with autoregressive recurrent networks," International Journal of Forecasting, vol. 36, no. 3, pp. 1181–1191, 2020.</w:t>
+      </w:r>
+    </w:p>
+    <w:p>
+      <w:pPr>
+        <w:spacing w:after="130" w:line="260"/>
+        <w:ind w:left="360" w:hanging="360"/>
+      </w:pPr>
+      <w:r>
+        <w:rPr>
+          <w:rFonts w:ascii="Calibri" w:cs="Calibri" w:eastAsia="Calibri" w:hAnsi="Calibri"/>
+          <w:sz w:val="21"/>
+          <w:szCs w:val="21"/>
+        </w:rPr>
+        <w:t xml:space="preserve">[16]  T. Hong and S. Fan, "Probabilistic electric load forecasting: A tutorial review," International Journal of Forecasting, vol. 32, no. 3, pp. 914–938, 2016.</w:t>
+      </w:r>
+    </w:p>
+    <w:p>
+      <w:pPr>
+        <w:spacing w:after="130" w:line="260"/>
+        <w:ind w:left="360" w:hanging="360"/>
+      </w:pPr>
+      <w:r>
+        <w:rPr>
+          <w:rFonts w:ascii="Calibri" w:cs="Calibri" w:eastAsia="Calibri" w:hAnsi="Calibri"/>
+          <w:sz w:val="21"/>
+          <w:szCs w:val="21"/>
+        </w:rPr>
+        <w:t xml:space="preserve">[17]  J. L. Ba, J. R. Kiros, and G. E. Hinton, "Layer normalization," arXiv preprint arXiv:1607.06450, 2016.</w:t>
+      </w:r>
+    </w:p>
+    <w:p>
+      <w:pPr>
+        <w:spacing w:after="130" w:line="260"/>
+        <w:ind w:left="360" w:hanging="360"/>
+      </w:pPr>
+      <w:r>
+        <w:rPr>
+          <w:rFonts w:ascii="Calibri" w:cs="Calibri" w:eastAsia="Calibri" w:hAnsi="Calibri"/>
+          <w:sz w:val="21"/>
+          <w:szCs w:val="21"/>
+        </w:rPr>
+        <w:t xml:space="preserve">[18]  N. Srivastava, G. Hinton, A. Krizhevsky, I. Sutskever, and R. Salakhutdinov, "Dropout: A simple way to prevent neural networks from overfitting," Journal of Machine Learning Research, vol. 15, pp. 1929–1958, 2014.</w:t>
+      </w:r>
+    </w:p>
+    <w:p>
+      <w:pPr>
+        <w:spacing w:after="130" w:line="260"/>
+        <w:ind w:left="360" w:hanging="360"/>
+      </w:pPr>
+      <w:r>
+        <w:rPr>
+          <w:rFonts w:ascii="Calibri" w:cs="Calibri" w:eastAsia="Calibri" w:hAnsi="Calibri"/>
+          <w:sz w:val="21"/>
+          <w:szCs w:val="21"/>
+        </w:rPr>
+        <w:t xml:space="preserve">[19]  R. Koenker and G. Bassett, Jr., "Regression quantiles," Econometrica, vol. 46, no. 1, pp. 33–50, 1978.</w:t>
+      </w:r>
+    </w:p>
+    <w:p>
+      <w:pPr>
+        <w:spacing w:after="130" w:line="260"/>
+        <w:ind w:left="360" w:hanging="360"/>
+      </w:pPr>
+      <w:r>
+        <w:rPr>
+          <w:rFonts w:ascii="Calibri" w:cs="Calibri" w:eastAsia="Calibri" w:hAnsi="Calibri"/>
+          <w:sz w:val="21"/>
+          <w:szCs w:val="21"/>
+        </w:rPr>
+        <w:t xml:space="preserve">[20]  R. Wen, K. Torkkola, B. Narayanaswamy, and D. Madeka, "A multi-horizon quantile recurrent forecaster," arXiv preprint arXiv:1711.11053, 2017.</w:t>
+      </w:r>
+    </w:p>
+    <w:p>
+      <w:pPr>
+        <w:spacing w:after="130" w:line="260"/>
+        <w:ind w:left="360" w:hanging="360"/>
+      </w:pPr>
+      <w:r>
+        <w:rPr>
+          <w:rFonts w:ascii="Calibri" w:cs="Calibri" w:eastAsia="Calibri" w:hAnsi="Calibri"/>
+          <w:sz w:val="21"/>
+          <w:szCs w:val="21"/>
+        </w:rPr>
+        <w:t xml:space="preserve">[21]  T. Hong, P. Pinson, S. Fan, H. Zareipour, A. Troccoli, and R. J. Hyndman, "Probabilistic energy forecasting: Global Energy Forecasting Competition 2014 and beyond," International Journal of Forecasting, vol. 32, no. 3, pp. 896–913, 2016.</w:t>
+      </w:r>
+    </w:p>
+    <w:p>
+      <w:pPr>
+        <w:spacing w:after="130" w:line="260"/>
+        <w:ind w:left="360" w:hanging="360"/>
+      </w:pPr>
+      <w:r>
+        <w:rPr>
+          <w:rFonts w:ascii="Calibri" w:cs="Calibri" w:eastAsia="Calibri" w:hAnsi="Calibri"/>
+          <w:sz w:val="21"/>
+          <w:szCs w:val="21"/>
+        </w:rPr>
+        <w:t xml:space="preserve">[22]  S. Makridakis, E. Spiliotis, and V. Assimakopoulos, "The M4 Competition: 100,000 time series and 61 forecasting methods," International Journal of Forecasting, vol. 36, no. 1, pp. 54–74, 2020.</w:t>
+      </w:r>
+    </w:p>
+    <w:p>
+      <w:pPr>
+        <w:spacing w:after="130" w:line="260"/>
+        <w:ind w:left="360" w:hanging="360"/>
+      </w:pPr>
+      <w:r>
+        <w:rPr>
+          <w:rFonts w:ascii="Calibri" w:cs="Calibri" w:eastAsia="Calibri" w:hAnsi="Calibri"/>
+          <w:sz w:val="21"/>
+          <w:szCs w:val="21"/>
+        </w:rPr>
+        <w:t xml:space="preserve">[23]  A. Paszke, S. Gross, F. Massa, A. Lerer, J. Bradbury, G. Chanan, T. Killeen, Z. Lin, N. Gimelshein, L. Antiga, A. Desmaison, A. Köpf, E. Yang, Z. DeVito, M. Raison, A. Tejani, S. Chilamkurthy, B. Steiner, L. Fang, J. Bai, and S. Chintala, "PyTorch: An imperative style, high-performance deep learning library," in Advances in Neural Information Processing Systems 32 (NeurIPS), 2019, pp. 8026–8037.</w:t>
       </w:r>
     </w:p>
     <w:p>

</xml_diff>